<commit_message>
feat(expert-teams): harden standalone delivery workflow
</commit_message>
<xml_diff>
--- a/hermes-local-lab/sources/docx-engine-v2/templates/standalone-meeting-minutes/template.docx
+++ b/hermes-local-lab/sources/docx-engine-v2/templates/standalone-meeting-minutes/template.docx
@@ -677,7 +677,7 @@
         <w:rFonts w:asciiTheme="minorHAnsi" w:eastAsiaTheme="minorEastAsia" w:hAnsiTheme="minorHAnsi" w:cstheme="minorBidi"/>
         <w:sz w:val="22"/>
         <w:szCs w:val="22"/>
-        <w:lang w:val="en-US" w:eastAsia="en-US" w:bidi="ar-SA"/>
+        <w:lang w:val="zh-CN" w:eastAsia="zh-CN" w:bidi="ar-SA"/>
       </w:rPr>
     </w:rPrDefault>
     <w:pPrDefault>
@@ -1486,7 +1486,7 @@
       </w:tabs>
     </w:pPr>
     <w:rPr>
-      <w:rFonts w:ascii="Courier" w:hAnsi="Courier"/>
+      <w:rFonts w:ascii="Arial" w:hAnsi="Arial"/>
       <w:sz w:val="20"/>
       <w:szCs w:val="20"/>
     </w:rPr>
@@ -1498,7 +1498,7 @@
     <w:uiPriority w:val="99"/>
     <w:rsid w:val="0029639D"/>
     <w:rPr>
-      <w:rFonts w:ascii="Courier" w:hAnsi="Courier"/>
+      <w:rFonts w:ascii="Arial" w:hAnsi="Arial"/>
       <w:sz w:val="20"/>
       <w:szCs w:val="20"/>
     </w:rPr>
@@ -12531,7 +12531,7 @@
         <w:rFonts w:asciiTheme="minorHAnsi" w:eastAsiaTheme="minorEastAsia" w:hAnsiTheme="minorHAnsi" w:cstheme="minorBidi"/>
         <w:sz w:val="22"/>
         <w:szCs w:val="22"/>
-        <w:lang w:val="en-US" w:eastAsia="en-US" w:bidi="ar-SA"/>
+        <w:lang w:val="zh-CN" w:eastAsia="zh-CN" w:bidi="ar-SA"/>
       </w:rPr>
     </w:rPrDefault>
     <w:pPrDefault>
@@ -13288,7 +13288,7 @@
       </w:tabs>
     </w:pPr>
     <w:rPr>
-      <w:rFonts w:ascii="Courier" w:hAnsi="Courier"/>
+      <w:rFonts w:ascii="Arial" w:hAnsi="Arial"/>
       <w:sz w:val="20"/>
       <w:szCs w:val="20"/>
     </w:rPr>
@@ -13300,7 +13300,7 @@
     <w:uiPriority w:val="99"/>
     <w:rsid w:val="0029639D"/>
     <w:rPr>
-      <w:rFonts w:ascii="Courier" w:hAnsi="Courier"/>
+      <w:rFonts w:ascii="Arial" w:hAnsi="Arial"/>
       <w:sz w:val="20"/>
       <w:szCs w:val="20"/>
     </w:rPr>
@@ -24368,74 +24368,74 @@
     </a:clrScheme>
     <a:fontScheme name="Office">
       <a:majorFont>
-        <a:latin typeface="Calibri"/>
+        <a:latin typeface="Arial"/>
         <a:ea typeface=""/>
         <a:cs typeface=""/>
-        <a:font script="Jpan" typeface="ＭＳ ゴシック"/>
-        <a:font script="Hang" typeface="맑은 고딕"/>
+        <a:font script="Jpan" typeface="黑体"/>
+        <a:font script="Hang" typeface="Arial"/>
         <a:font script="Hans" typeface="宋体"/>
-        <a:font script="Hant" typeface="新細明體"/>
-        <a:font script="Arab" typeface="Times New Roman"/>
-        <a:font script="Hebr" typeface="Times New Roman"/>
-        <a:font script="Thai" typeface="Angsana New"/>
-        <a:font script="Ethi" typeface="Nyala"/>
-        <a:font script="Beng" typeface="Vrinda"/>
-        <a:font script="Gujr" typeface="Shruti"/>
-        <a:font script="Khmr" typeface="MoolBoran"/>
-        <a:font script="Knda" typeface="Tunga"/>
-        <a:font script="Guru" typeface="Raavi"/>
-        <a:font script="Cans" typeface="Euphemia"/>
-        <a:font script="Cher" typeface="Plantagenet Cherokee"/>
-        <a:font script="Yiii" typeface="Microsoft Yi Baiti"/>
-        <a:font script="Tibt" typeface="Microsoft Himalaya"/>
-        <a:font script="Thaa" typeface="MV Boli"/>
-        <a:font script="Deva" typeface="Mangal"/>
-        <a:font script="Telu" typeface="Gautami"/>
-        <a:font script="Taml" typeface="Latha"/>
-        <a:font script="Syrc" typeface="Estrangelo Edessa"/>
-        <a:font script="Orya" typeface="Kalinga"/>
-        <a:font script="Mlym" typeface="Kartika"/>
-        <a:font script="Laoo" typeface="DokChampa"/>
-        <a:font script="Sinh" typeface="Iskoola Pota"/>
-        <a:font script="Mong" typeface="Mongolian Baiti"/>
-        <a:font script="Viet" typeface="Times New Roman"/>
-        <a:font script="Uigh" typeface="Microsoft Uighur"/>
-        <a:font script="Geor" typeface="Sylfaen"/>
+        <a:font script="Hant" typeface="Arial"/>
+        <a:font script="Arab" typeface="Arial"/>
+        <a:font script="Hebr" typeface="Arial"/>
+        <a:font script="Thai" typeface="Arial"/>
+        <a:font script="Ethi" typeface="Arial"/>
+        <a:font script="Beng" typeface="Arial"/>
+        <a:font script="Gujr" typeface="Arial"/>
+        <a:font script="Khmr" typeface="Arial"/>
+        <a:font script="Knda" typeface="Arial"/>
+        <a:font script="Guru" typeface="Arial"/>
+        <a:font script="Cans" typeface="Arial"/>
+        <a:font script="Cher" typeface="Arial"/>
+        <a:font script="Yiii" typeface="Arial"/>
+        <a:font script="Tibt" typeface="Arial"/>
+        <a:font script="Thaa" typeface="Arial"/>
+        <a:font script="Deva" typeface="Arial"/>
+        <a:font script="Telu" typeface="Arial"/>
+        <a:font script="Taml" typeface="Arial"/>
+        <a:font script="Syrc" typeface="Arial"/>
+        <a:font script="Orya" typeface="Arial"/>
+        <a:font script="Mlym" typeface="Arial"/>
+        <a:font script="Laoo" typeface="Arial"/>
+        <a:font script="Sinh" typeface="Arial"/>
+        <a:font script="Mong" typeface="Arial"/>
+        <a:font script="Viet" typeface="Arial"/>
+        <a:font script="Uigh" typeface="Arial"/>
+        <a:font script="Geor" typeface="Arial"/>
       </a:majorFont>
       <a:minorFont>
-        <a:latin typeface="Cambria"/>
+        <a:latin typeface="Arial"/>
         <a:ea typeface=""/>
         <a:cs typeface=""/>
-        <a:font script="Jpan" typeface="ＭＳ 明朝"/>
-        <a:font script="Hang" typeface="맑은 고딕"/>
+        <a:font script="Jpan" typeface="宋体"/>
+        <a:font script="Hang" typeface="Arial"/>
         <a:font script="Hans" typeface="宋体"/>
-        <a:font script="Hant" typeface="新細明體"/>
+        <a:font script="Hant" typeface="Arial"/>
         <a:font script="Arab" typeface="Arial"/>
         <a:font script="Hebr" typeface="Arial"/>
-        <a:font script="Thai" typeface="Cordia New"/>
-        <a:font script="Ethi" typeface="Nyala"/>
-        <a:font script="Beng" typeface="Vrinda"/>
-        <a:font script="Gujr" typeface="Shruti"/>
-        <a:font script="Khmr" typeface="DaunPenh"/>
-        <a:font script="Knda" typeface="Tunga"/>
-        <a:font script="Guru" typeface="Raavi"/>
-        <a:font script="Cans" typeface="Euphemia"/>
-        <a:font script="Cher" typeface="Plantagenet Cherokee"/>
-        <a:font script="Yiii" typeface="Microsoft Yi Baiti"/>
-        <a:font script="Tibt" typeface="Microsoft Himalaya"/>
-        <a:font script="Thaa" typeface="MV Boli"/>
-        <a:font script="Deva" typeface="Mangal"/>
-        <a:font script="Telu" typeface="Gautami"/>
-        <a:font script="Taml" typeface="Latha"/>
-        <a:font script="Syrc" typeface="Estrangelo Edessa"/>
-        <a:font script="Orya" typeface="Kalinga"/>
-        <a:font script="Mlym" typeface="Kartika"/>
-        <a:font script="Laoo" typeface="DokChampa"/>
-        <a:font script="Sinh" typeface="Iskoola Pota"/>
-        <a:font script="Mong" typeface="Mongolian Baiti"/>
+        <a:font script="Thai" typeface="Arial"/>
+        <a:font script="Ethi" typeface="Arial"/>
+        <a:font script="Beng" typeface="Arial"/>
+        <a:font script="Gujr" typeface="Arial"/>
+        <a:font script="Khmr" typeface="Arial"/>
+        <a:font script="Knda" typeface="Arial"/>
+        <a:font script="Guru" typeface="Arial"/>
+        <a:font script="Cans" typeface="Arial"/>
+        <a:font script="Cher" typeface="Arial"/>
+        <a:font script="Yiii" typeface="Arial"/>
+        <a:font script="Tibt" typeface="Arial"/>
+        <a:font script="Thaa" typeface="Arial"/>
+        <a:font script="Deva" typeface="Arial"/>
+        <a:font script="Telu" typeface="Arial"/>
+        <a:font script="Taml" typeface="Arial"/>
+        <a:font script="Syrc" typeface="Arial"/>
+        <a:font script="Orya" typeface="Arial"/>
+        <a:font script="Mlym" typeface="Arial"/>
+        <a:font script="Laoo" typeface="Arial"/>
+        <a:font script="Sinh" typeface="Arial"/>
+        <a:font script="Mong" typeface="Arial"/>
         <a:font script="Viet" typeface="Arial"/>
-        <a:font script="Uigh" typeface="Microsoft Uighur"/>
-        <a:font script="Geor" typeface="Sylfaen"/>
+        <a:font script="Uigh" typeface="Arial"/>
+        <a:font script="Geor" typeface="Arial"/>
       </a:minorFont>
     </a:fontScheme>
     <a:fmtScheme name="Office">

</xml_diff>